<commit_message>
Update XP Story Cards v3
</commit_message>
<xml_diff>
--- a/MACHOWSKI_JAKUBOWSKI_RYBARCZYK_NOWICKI_xpStoryCards.docx
+++ b/MACHOWSKI_JAKUBOWSKI_RYBARCZYK_NOWICKI_xpStoryCards.docx
@@ -2,6 +2,177 @@
 <file path=word/document.xml><?xml version="1.0" encoding="utf-8"?>
 <w:document xmlns:o="urn:schemas-microsoft-com:office:office" xmlns:r="http://schemas.openxmlformats.org/officeDocument/2006/relationships" xmlns:v="urn:schemas-microsoft-com:vml" xmlns:w="http://schemas.openxmlformats.org/wordprocessingml/2006/main" xmlns:w10="urn:schemas-microsoft-com:office:word" xmlns:wp="http://schemas.openxmlformats.org/drawingml/2006/wordprocessingDrawing" xmlns:wps="http://schemas.microsoft.com/office/word/2010/wordprocessingShape" xmlns:wpg="http://schemas.microsoft.com/office/word/2010/wordprocessingGroup" xmlns:mc="http://schemas.openxmlformats.org/markup-compatibility/2006" xmlns:wp14="http://schemas.microsoft.com/office/word/2010/wordprocessingDrawing" xmlns:w14="http://schemas.microsoft.com/office/word/2010/wordml" xmlns:w15="http://schemas.microsoft.com/office/word/2012/wordml" mc:Ignorable="w14 wp14 w15">
   <w:body>
+    <w:p>
+      <w:pPr>
+        <w:pStyle w:val="Normal"/>
+        <w:spacing w:lineRule="auto" w:line="360" w:before="240" w:after="0"/>
+        <w:jc w:val="center"/>
+        <w:rPr>
+          <w:rFonts w:ascii="Calibri" w:hAnsi="Calibri" w:eastAsia="Calibri" w:cs="Calibri"/>
+          <w:i/>
+          <w:i/>
+          <w:iCs/>
+          <w:sz w:val="40"/>
+          <w:szCs w:val="40"/>
+        </w:rPr>
+      </w:pPr>
+      <w:r>
+        <w:rPr>
+          <w:rFonts w:eastAsia="Calibri" w:cs="Calibri" w:ascii="Calibri" w:hAnsi="Calibri"/>
+          <w:i/>
+          <w:iCs/>
+          <w:sz w:val="40"/>
+          <w:szCs w:val="40"/>
+        </w:rPr>
+        <w:drawing>
+          <wp:inline distT="0" distB="0" distL="0" distR="0">
+            <wp:extent cx="5466080" cy="4857750"/>
+            <wp:effectExtent l="0" t="0" r="0" b="0"/>
+            <wp:docPr id="1" name="Obraz1" descr=""/>
+            <wp:cNvGraphicFramePr>
+              <a:graphicFrameLocks xmlns:a="http://schemas.openxmlformats.org/drawingml/2006/main" noChangeAspect="1"/>
+            </wp:cNvGraphicFramePr>
+            <a:graphic xmlns:a="http://schemas.openxmlformats.org/drawingml/2006/main">
+              <a:graphicData uri="http://schemas.openxmlformats.org/drawingml/2006/picture">
+                <pic:pic xmlns:pic="http://schemas.openxmlformats.org/drawingml/2006/picture">
+                  <pic:nvPicPr>
+                    <pic:cNvPr id="1" name="Obraz1" descr=""/>
+                    <pic:cNvPicPr>
+                      <a:picLocks noChangeAspect="1" noChangeArrowheads="1"/>
+                    </pic:cNvPicPr>
+                  </pic:nvPicPr>
+                  <pic:blipFill>
+                    <a:blip r:embed="rId2"/>
+                    <a:stretch>
+                      <a:fillRect/>
+                    </a:stretch>
+                  </pic:blipFill>
+                  <pic:spPr bwMode="auto">
+                    <a:xfrm>
+                      <a:off x="0" y="0"/>
+                      <a:ext cx="5466080" cy="4857750"/>
+                    </a:xfrm>
+                    <a:prstGeom prst="rect">
+                      <a:avLst/>
+                    </a:prstGeom>
+                  </pic:spPr>
+                </pic:pic>
+              </a:graphicData>
+            </a:graphic>
+          </wp:inline>
+        </w:drawing>
+      </w:r>
+    </w:p>
+    <w:p>
+      <w:pPr>
+        <w:pStyle w:val="Normal"/>
+        <w:spacing w:lineRule="auto" w:line="360" w:before="240" w:after="0"/>
+        <w:jc w:val="center"/>
+        <w:rPr>
+          <w:rFonts w:ascii="Calibri" w:hAnsi="Calibri" w:eastAsia="Calibri" w:cs="Calibri"/>
+          <w:i/>
+          <w:i/>
+          <w:iCs/>
+          <w:sz w:val="40"/>
+          <w:szCs w:val="40"/>
+        </w:rPr>
+      </w:pPr>
+      <w:r>
+        <w:rPr>
+          <w:rFonts w:eastAsia="Calibri" w:cs="Calibri" w:ascii="Calibri" w:hAnsi="Calibri"/>
+          <w:i/>
+          <w:iCs/>
+          <w:sz w:val="40"/>
+          <w:szCs w:val="40"/>
+        </w:rPr>
+        <w:t>TIDA 2025/2026</w:t>
+      </w:r>
+    </w:p>
+    <w:p>
+      <w:pPr>
+        <w:pStyle w:val="Normal"/>
+        <w:spacing w:lineRule="auto" w:line="360" w:before="0" w:after="0"/>
+        <w:jc w:val="center"/>
+        <w:rPr>
+          <w:rFonts w:ascii="Calibri" w:hAnsi="Calibri" w:eastAsia="Calibri" w:cs="Calibri"/>
+          <w:b/>
+          <w:bCs/>
+          <w:sz w:val="48"/>
+          <w:szCs w:val="48"/>
+        </w:rPr>
+      </w:pPr>
+      <w:r>
+        <w:rPr>
+          <w:rFonts w:eastAsia="Calibri" w:cs="Calibri" w:ascii="Calibri" w:hAnsi="Calibri"/>
+          <w:b/>
+          <w:bCs/>
+          <w:sz w:val="48"/>
+          <w:szCs w:val="48"/>
+        </w:rPr>
+        <w:t xml:space="preserve"> </w:t>
+      </w:r>
+      <w:r>
+        <w:rPr>
+          <w:rFonts w:eastAsia="Calibri" w:cs="Calibri" w:ascii="Calibri" w:hAnsi="Calibri"/>
+          <w:b/>
+          <w:bCs/>
+          <w:sz w:val="48"/>
+          <w:szCs w:val="48"/>
+        </w:rPr>
+        <w:t>XP Story Cards</w:t>
+      </w:r>
+    </w:p>
+    <w:p>
+      <w:pPr>
+        <w:pStyle w:val="Normal"/>
+        <w:spacing w:lineRule="auto" w:line="360" w:before="0" w:after="0"/>
+        <w:jc w:val="center"/>
+        <w:rPr>
+          <w:rFonts w:ascii="Calibri" w:hAnsi="Calibri" w:eastAsia="Calibri" w:cs="Calibri"/>
+          <w:i/>
+          <w:i/>
+          <w:iCs/>
+          <w:sz w:val="36"/>
+          <w:szCs w:val="36"/>
+        </w:rPr>
+      </w:pPr>
+      <w:r>
+        <w:rPr>
+          <w:rFonts w:eastAsia="Calibri" w:cs="Calibri" w:ascii="Calibri" w:hAnsi="Calibri"/>
+          <w:b/>
+          <w:bCs/>
+          <w:i/>
+          <w:iCs/>
+          <w:sz w:val="36"/>
+          <w:szCs w:val="36"/>
+        </w:rPr>
+        <w:t xml:space="preserve">Przygotował: Julian Machowski, </w:t>
+      </w:r>
+      <w:r>
+        <w:rPr>
+          <w:rFonts w:eastAsia="Calibri" w:cs="Calibri" w:ascii="Calibri" w:hAnsi="Calibri"/>
+          <w:b/>
+          <w:bCs/>
+          <w:i/>
+          <w:iCs/>
+          <w:sz w:val="36"/>
+          <w:szCs w:val="36"/>
+        </w:rPr>
+        <w:t>Gracjan Jakubowski, Mateusz Rybarczyk, Alan Nowicki  4</w:t>
+      </w:r>
+      <w:r>
+        <w:rPr>
+          <w:rFonts w:eastAsia="Calibri" w:cs="Calibri" w:ascii="Calibri" w:hAnsi="Calibri"/>
+          <w:b/>
+          <w:bCs/>
+          <w:i/>
+          <w:iCs/>
+          <w:sz w:val="36"/>
+          <w:szCs w:val="36"/>
+        </w:rPr>
+        <w:t>TP</w:t>
+      </w:r>
+    </w:p>
     <w:p>
       <w:pPr>
         <w:pStyle w:val="BodyText"/>
@@ -13,22 +184,63 @@
         </w:rPr>
       </w:pPr>
       <w:r>
-        <w:rPr>
-          <w:rFonts w:ascii="Cascadia Mono SemiBold" w:hAnsi="Cascadia Mono SemiBold"/>
-          <w:b/>
-          <w:bCs/>
-          <w:sz w:val="28"/>
-          <w:szCs w:val="28"/>
-        </w:rPr>
-        <w:t xml:space="preserve">4TP </w:t>
+        <w:rPr/>
       </w:r>
-      <w:r>
+    </w:p>
+    <w:p>
+      <w:pPr>
+        <w:pStyle w:val="BodyText"/>
+        <w:jc w:val="center"/>
         <w:rPr>
           <w:rFonts w:ascii="Cascadia Mono SemiBold" w:hAnsi="Cascadia Mono SemiBold"/>
           <w:b/>
           <w:bCs/>
         </w:rPr>
-        <w:t>Julian Machowski, Gracjan Jakubowski, Mateusz Rybarczyk, Alan Nowicki</w:t>
+      </w:pPr>
+      <w:r>
+        <w:rPr/>
+      </w:r>
+    </w:p>
+    <w:p>
+      <w:pPr>
+        <w:pStyle w:val="BodyText"/>
+        <w:jc w:val="center"/>
+        <w:rPr>
+          <w:rFonts w:ascii="Cascadia Mono SemiBold" w:hAnsi="Cascadia Mono SemiBold"/>
+          <w:b/>
+          <w:bCs/>
+        </w:rPr>
+      </w:pPr>
+      <w:r>
+        <w:rPr/>
+      </w:r>
+    </w:p>
+    <w:p>
+      <w:pPr>
+        <w:pStyle w:val="BodyText"/>
+        <w:jc w:val="center"/>
+        <w:rPr>
+          <w:rFonts w:ascii="Cascadia Mono SemiBold" w:hAnsi="Cascadia Mono SemiBold"/>
+          <w:b/>
+          <w:bCs/>
+        </w:rPr>
+      </w:pPr>
+      <w:r>
+        <w:rPr/>
+      </w:r>
+    </w:p>
+    <w:p>
+      <w:pPr>
+        <w:pStyle w:val="BodyText"/>
+        <w:jc w:val="center"/>
+        <w:rPr>
+          <w:rFonts w:ascii="Cascadia Mono SemiBold" w:hAnsi="Cascadia Mono SemiBold"/>
+          <w:b/>
+          <w:bCs/>
+        </w:rPr>
+      </w:pPr>
+      <w:r>
+        <w:rPr/>
       </w:r>
     </w:p>
     <w:tbl>
@@ -3701,10 +3913,12 @@
       </w:r>
     </w:p>
     <w:sectPr>
-      <w:headerReference w:type="default" r:id="rId2"/>
-      <w:footerReference w:type="even" r:id="rId3"/>
-      <w:footerReference w:type="default" r:id="rId4"/>
-      <w:footerReference w:type="first" r:id="rId5"/>
+      <w:headerReference w:type="even" r:id="rId3"/>
+      <w:headerReference w:type="default" r:id="rId4"/>
+      <w:headerReference w:type="first" r:id="rId5"/>
+      <w:footerReference w:type="even" r:id="rId6"/>
+      <w:footerReference w:type="default" r:id="rId7"/>
+      <w:footerReference w:type="first" r:id="rId8"/>
       <w:type w:val="nextPage"/>
       <w:pgSz w:w="11906" w:h="16838"/>
       <w:pgMar w:left="1134" w:right="1134" w:gutter="0" w:header="1134" w:top="1693" w:footer="708" w:bottom="1134"/>
@@ -3762,7 +3976,7 @@
         </w:r>
         <w:r>
           <w:rPr/>
-          <w:t>5</w:t>
+          <w:t>6</w:t>
         </w:r>
         <w:r>
           <w:rPr/>
@@ -3814,7 +4028,7 @@
         </w:r>
         <w:r>
           <w:rPr/>
-          <w:t>5</w:t>
+          <w:t>6</w:t>
         </w:r>
         <w:r>
           <w:rPr/>
@@ -3836,6 +4050,34 @@
 </file>
 
 <file path=word/header1.xml><?xml version="1.0" encoding="utf-8"?>
+<w:hdr xmlns:o="urn:schemas-microsoft-com:office:office" xmlns:r="http://schemas.openxmlformats.org/officeDocument/2006/relationships" xmlns:v="urn:schemas-microsoft-com:vml" xmlns:w="http://schemas.openxmlformats.org/wordprocessingml/2006/main" xmlns:w10="urn:schemas-microsoft-com:office:word" xmlns:wp="http://schemas.openxmlformats.org/drawingml/2006/wordprocessingDrawing" xmlns:wps="http://schemas.microsoft.com/office/word/2010/wordprocessingShape" xmlns:wpg="http://schemas.microsoft.com/office/word/2010/wordprocessingGroup" xmlns:mc="http://schemas.openxmlformats.org/markup-compatibility/2006" xmlns:wp14="http://schemas.microsoft.com/office/word/2010/wordprocessingDrawing" xmlns:w14="http://schemas.microsoft.com/office/word/2010/wordml" xmlns:w15="http://schemas.microsoft.com/office/word/2012/wordml" mc:Ignorable="w14 wp14 w15">
+  <w:p>
+    <w:pPr>
+      <w:pStyle w:val="Header"/>
+      <w:rPr/>
+    </w:pPr>
+    <w:r>
+      <w:rPr/>
+    </w:r>
+  </w:p>
+</w:hdr>
+</file>
+
+<file path=word/header2.xml><?xml version="1.0" encoding="utf-8"?>
+<w:hdr xmlns:o="urn:schemas-microsoft-com:office:office" xmlns:r="http://schemas.openxmlformats.org/officeDocument/2006/relationships" xmlns:v="urn:schemas-microsoft-com:vml" xmlns:w="http://schemas.openxmlformats.org/wordprocessingml/2006/main" xmlns:w10="urn:schemas-microsoft-com:office:word" xmlns:wp="http://schemas.openxmlformats.org/drawingml/2006/wordprocessingDrawing" xmlns:wps="http://schemas.microsoft.com/office/word/2010/wordprocessingShape" xmlns:wpg="http://schemas.microsoft.com/office/word/2010/wordprocessingGroup" xmlns:mc="http://schemas.openxmlformats.org/markup-compatibility/2006" xmlns:wp14="http://schemas.microsoft.com/office/word/2010/wordprocessingDrawing" xmlns:w14="http://schemas.microsoft.com/office/word/2010/wordml" xmlns:w15="http://schemas.microsoft.com/office/word/2012/wordml" mc:Ignorable="w14 wp14 w15">
+  <w:p>
+    <w:pPr>
+      <w:pStyle w:val="Header"/>
+      <w:rPr/>
+    </w:pPr>
+    <w:r>
+      <w:rPr/>
+    </w:r>
+  </w:p>
+</w:hdr>
+</file>
+
+<file path=word/header3.xml><?xml version="1.0" encoding="utf-8"?>
 <w:hdr xmlns:o="urn:schemas-microsoft-com:office:office" xmlns:r="http://schemas.openxmlformats.org/officeDocument/2006/relationships" xmlns:v="urn:schemas-microsoft-com:vml" xmlns:w="http://schemas.openxmlformats.org/wordprocessingml/2006/main" xmlns:w10="urn:schemas-microsoft-com:office:word" xmlns:wp="http://schemas.openxmlformats.org/drawingml/2006/wordprocessingDrawing" xmlns:wps="http://schemas.microsoft.com/office/word/2010/wordprocessingShape" xmlns:wpg="http://schemas.microsoft.com/office/word/2010/wordprocessingGroup" xmlns:mc="http://schemas.openxmlformats.org/markup-compatibility/2006" xmlns:wp14="http://schemas.microsoft.com/office/word/2010/wordprocessingDrawing" xmlns:w14="http://schemas.microsoft.com/office/word/2010/wordml" xmlns:w15="http://schemas.microsoft.com/office/word/2012/wordml" mc:Ignorable="w14 wp14 w15">
   <w:p>
     <w:pPr>

</xml_diff>